<commit_message>
Update academic CV and IACL32 talk
</commit_message>
<xml_diff>
--- a/files/Zinan_Liang_Academic_CV.docx
+++ b/files/Zinan_Liang_Academic_CV.docx
@@ -332,11 +332,12 @@
       </w:tblPr>
       <w:tblGrid>
         <w:gridCol w:w="3758"/>
-        <w:gridCol w:w="2430"/>
-        <w:gridCol w:w="355"/>
+        <w:gridCol w:w="2785"/>
         <w:gridCol w:w="462"/>
         <w:gridCol w:w="686"/>
-        <w:gridCol w:w="2332"/>
+        <w:gridCol w:w="247"/>
+        <w:gridCol w:w="142"/>
+        <w:gridCol w:w="1943"/>
       </w:tblGrid>
       <w:tr>
         <w:trPr>
@@ -345,7 +346,7 @@
         <w:tc>
           <w:tcPr>
             <w:tcW w:w="7005" w:type="dxa"/>
-            <w:gridSpan w:val="4"/>
+            <w:gridSpan w:val="3"/>
             <w:tcBorders>
               <w:top w:val="single" w:sz="12" w:space="0" w:color="000000" w:themeColor="text1"/>
               <w:left w:val="nil"/>
@@ -401,7 +402,7 @@
         <w:tc>
           <w:tcPr>
             <w:tcW w:w="3018" w:type="dxa"/>
-            <w:gridSpan w:val="2"/>
+            <w:gridSpan w:val="4"/>
             <w:tcBorders>
               <w:top w:val="single" w:sz="12" w:space="0" w:color="000000" w:themeColor="text1"/>
               <w:left w:val="nil"/>
@@ -439,7 +440,7 @@
         <w:tc>
           <w:tcPr>
             <w:tcW w:w="7005" w:type="dxa"/>
-            <w:gridSpan w:val="4"/>
+            <w:gridSpan w:val="3"/>
             <w:tcBorders>
               <w:top w:val="none" w:sz="12" w:space="0" w:color="000000" w:themeColor="text1"/>
               <w:left w:val="none" w:sz="4" w:space="0" w:color="000000" w:themeColor="text1"/>
@@ -466,7 +467,7 @@
         <w:tc>
           <w:tcPr>
             <w:tcW w:w="3018" w:type="dxa"/>
-            <w:gridSpan w:val="2"/>
+            <w:gridSpan w:val="4"/>
             <w:tcBorders>
               <w:top w:val="none" w:sz="12" w:space="0" w:color="000000" w:themeColor="text1"/>
               <w:left w:val="none" w:sz="4" w:space="0" w:color="000000" w:themeColor="text1"/>
@@ -504,7 +505,7 @@
         <w:tc>
           <w:tcPr>
             <w:tcW w:w="7005" w:type="dxa"/>
-            <w:gridSpan w:val="4"/>
+            <w:gridSpan w:val="3"/>
             <w:tcBorders>
               <w:top w:val="dotted" w:sz="12" w:space="0" w:color="000000" w:themeColor="text1"/>
               <w:left w:val="nil"/>
@@ -551,7 +552,7 @@
         <w:tc>
           <w:tcPr>
             <w:tcW w:w="3018" w:type="dxa"/>
-            <w:gridSpan w:val="2"/>
+            <w:gridSpan w:val="4"/>
             <w:tcBorders>
               <w:top w:val="dotted" w:sz="12" w:space="0" w:color="000000" w:themeColor="text1"/>
               <w:left w:val="nil"/>
@@ -589,7 +590,7 @@
         <w:tc>
           <w:tcPr>
             <w:tcW w:w="7005" w:type="dxa"/>
-            <w:gridSpan w:val="4"/>
+            <w:gridSpan w:val="3"/>
             <w:tcBorders>
               <w:top w:val="none" w:sz="4" w:space="0" w:color="000000" w:themeColor="text1"/>
               <w:left w:val="none" w:sz="4" w:space="0" w:color="000000" w:themeColor="text1"/>
@@ -645,7 +646,7 @@
         <w:tc>
           <w:tcPr>
             <w:tcW w:w="3018" w:type="dxa"/>
-            <w:gridSpan w:val="2"/>
+            <w:gridSpan w:val="4"/>
             <w:tcBorders>
               <w:top w:val="none" w:sz="4" w:space="0" w:color="000000" w:themeColor="text1"/>
               <w:left w:val="none" w:sz="4" w:space="0" w:color="000000" w:themeColor="text1"/>
@@ -679,7 +680,7 @@
         <w:tc>
           <w:tcPr>
             <w:tcW w:w="10023" w:type="dxa"/>
-            <w:gridSpan w:val="6"/>
+            <w:gridSpan w:val="7"/>
             <w:tcBorders>
               <w:top w:val="nil"/>
               <w:left w:val="nil"/>
@@ -691,7 +692,7 @@
             <w:pPr>
               <w:pStyle w:val="Professionaltitle"/>
               <w:rPr>
-                <w:rFonts w:ascii="Tahoma" w:eastAsia="Tahoma" w:hAnsi="Tahoma" w:cs="Tahoma" w:hint="eastAsia"/>
+                <w:rFonts w:ascii="Tahoma" w:eastAsia="Tahoma" w:hAnsi="Tahoma" w:cs="Tahoma"/>
                 <w:lang w:eastAsia="zh-TW"/>
               </w:rPr>
             </w:pPr>
@@ -711,7 +712,7 @@
         <w:tc>
           <w:tcPr>
             <w:tcW w:w="10023" w:type="dxa"/>
-            <w:gridSpan w:val="6"/>
+            <w:gridSpan w:val="7"/>
             <w:tcBorders>
               <w:top w:val="nil"/>
               <w:left w:val="nil"/>
@@ -905,10 +906,118 @@
         </w:trPr>
         <w:tc>
           <w:tcPr>
-            <w:tcW w:w="6188" w:type="dxa"/>
-            <w:gridSpan w:val="2"/>
+            <w:tcW w:w="8080" w:type="dxa"/>
+            <w:gridSpan w:val="6"/>
             <w:tcBorders>
               <w:top w:val="single" w:sz="12" w:space="0" w:color="auto"/>
+              <w:left w:val="nil"/>
+              <w:bottom w:val="nil"/>
+              <w:right w:val="nil"/>
+            </w:tcBorders>
+          </w:tcPr>
+          <w:p>
+            <w:pPr>
+              <w:pStyle w:val="Subtitle"/>
+              <w:rPr>
+                <w:b/>
+                <w:bCs/>
+                <w:sz w:val="20"/>
+                <w:szCs w:val="20"/>
+                <w:lang w:eastAsia="zh-CN"/>
+              </w:rPr>
+            </w:pPr>
+            <w:r>
+              <w:rPr>
+                <w:b/>
+                <w:bCs/>
+                <w:sz w:val="20"/>
+                <w:szCs w:val="20"/>
+                <w:lang w:eastAsia="zh-CN"/>
+              </w:rPr>
+              <w:t>32nd Annual Conference of the International Association of Chinese Linguistics (IACL-32)</w:t>
+            </w:r>
+          </w:p>
+        </w:tc>
+        <w:tc>
+          <w:tcPr>
+            <w:tcW w:w="1943" w:type="dxa"/>
+            <w:tcBorders>
+              <w:top w:val="single" w:sz="12" w:space="0" w:color="auto"/>
+              <w:left w:val="nil"/>
+              <w:bottom w:val="nil"/>
+              <w:right w:val="nil"/>
+            </w:tcBorders>
+          </w:tcPr>
+          <w:p>
+            <w:pPr>
+              <w:pStyle w:val="Subtitle"/>
+              <w:jc w:val="right"/>
+              <w:rPr>
+                <w:i/>
+                <w:iCs/>
+                <w:sz w:val="20"/>
+                <w:szCs w:val="20"/>
+              </w:rPr>
+            </w:pPr>
+            <w:r>
+              <w:rPr>
+                <w:i/>
+                <w:iCs/>
+                <w:sz w:val="20"/>
+                <w:szCs w:val="20"/>
+              </w:rPr>
+              <w:t>Jun 2026</w:t>
+            </w:r>
+          </w:p>
+        </w:tc>
+      </w:tr>
+      <w:tr>
+        <w:trPr>
+          <w:trHeight w:val="495"/>
+        </w:trPr>
+        <w:tc>
+          <w:tcPr>
+            <w:tcW w:w="10023" w:type="dxa"/>
+            <w:gridSpan w:val="7"/>
+            <w:tcBorders>
+              <w:top w:val="nil"/>
+              <w:left w:val="nil"/>
+              <w:bottom w:val="single" w:sz="4" w:space="0" w:color="auto"/>
+              <w:right w:val="nil"/>
+            </w:tcBorders>
+          </w:tcPr>
+          <w:p>
+            <w:pPr>
+              <w:pStyle w:val="Subtitle"/>
+              <w:jc w:val="right"/>
+              <w:rPr>
+                <w:i/>
+                <w:iCs/>
+                <w:sz w:val="20"/>
+                <w:szCs w:val="20"/>
+              </w:rPr>
+            </w:pPr>
+            <w:r>
+              <w:rPr>
+                <w:sz w:val="20"/>
+                <w:szCs w:val="20"/>
+                <w:lang w:eastAsia="zh-CN"/>
+              </w:rPr>
+              <w:t>“A typology of ‘finger’ as ‘little hand’: a shared morphological strategy in Western Yue-speaking Region.” Co-presented with Ching-Hei Yim.</w:t>
+            </w:r>
+          </w:p>
+        </w:tc>
+      </w:tr>
+      <w:tr>
+        <w:trPr>
+          <w:trHeight w:val="495"/>
+        </w:trPr>
+        <w:tc>
+          <w:tcPr>
+            <w:tcW w:w="7938" w:type="dxa"/>
+            <w:gridSpan w:val="5"/>
+            <w:tcBorders>
+              <w:top w:val="single" w:sz="4" w:space="0" w:color="auto"/>
               <w:left w:val="nil"/>
               <w:bottom w:val="none" w:sz="4" w:space="0" w:color="000000" w:themeColor="text1"/>
               <w:right w:val="nil"/>
@@ -960,10 +1069,10 @@
         </w:tc>
         <w:tc>
           <w:tcPr>
-            <w:tcW w:w="3835" w:type="dxa"/>
-            <w:gridSpan w:val="4"/>
+            <w:tcW w:w="2085" w:type="dxa"/>
+            <w:gridSpan w:val="2"/>
             <w:tcBorders>
-              <w:top w:val="single" w:sz="12" w:space="0" w:color="auto"/>
+              <w:top w:val="single" w:sz="4" w:space="0" w:color="auto"/>
               <w:left w:val="nil"/>
               <w:bottom w:val="none" w:sz="4" w:space="0" w:color="000000" w:themeColor="text1"/>
               <w:right w:val="nil"/>
@@ -999,7 +1108,7 @@
         <w:tc>
           <w:tcPr>
             <w:tcW w:w="10023" w:type="dxa"/>
-            <w:gridSpan w:val="6"/>
+            <w:gridSpan w:val="7"/>
             <w:tcBorders>
               <w:top w:val="none" w:sz="12" w:space="0" w:color="000000" w:themeColor="text1"/>
               <w:left w:val="none" w:sz="4" w:space="0" w:color="000000" w:themeColor="text1"/>
@@ -1011,8 +1120,6 @@
             <w:pPr>
               <w:pStyle w:val="Subtitle"/>
               <w:rPr>
-                <w:b/>
-                <w:bCs/>
                 <w:sz w:val="20"/>
                 <w:szCs w:val="20"/>
                 <w:lang w:eastAsia="zh-CN"/>
@@ -1020,8 +1127,6 @@
             </w:pPr>
             <w:r>
               <w:rPr>
-                <w:b/>
-                <w:bCs/>
                 <w:sz w:val="20"/>
                 <w:szCs w:val="20"/>
                 <w:lang w:eastAsia="zh-CN"/>
@@ -1031,8 +1136,6 @@
             <w:proofErr w:type="spellStart"/>
             <w:r>
               <w:rPr>
-                <w:b/>
-                <w:bCs/>
                 <w:sz w:val="20"/>
                 <w:szCs w:val="20"/>
                 <w:lang w:eastAsia="zh-CN"/>
@@ -1042,8 +1145,6 @@
             <w:proofErr w:type="spellEnd"/>
             <w:r>
               <w:rPr>
-                <w:b/>
-                <w:bCs/>
                 <w:sz w:val="20"/>
                 <w:szCs w:val="20"/>
                 <w:lang w:eastAsia="zh-CN"/>
@@ -1067,8 +1168,8 @@
         </w:trPr>
         <w:tc>
           <w:tcPr>
-            <w:tcW w:w="6188" w:type="dxa"/>
-            <w:gridSpan w:val="2"/>
+            <w:tcW w:w="7938" w:type="dxa"/>
+            <w:gridSpan w:val="5"/>
             <w:tcBorders>
               <w:top w:val="dotted" w:sz="12" w:space="0" w:color="000000" w:themeColor="text1"/>
               <w:left w:val="nil"/>
@@ -1100,8 +1201,8 @@
         </w:tc>
         <w:tc>
           <w:tcPr>
-            <w:tcW w:w="3835" w:type="dxa"/>
-            <w:gridSpan w:val="4"/>
+            <w:tcW w:w="2085" w:type="dxa"/>
+            <w:gridSpan w:val="2"/>
             <w:tcBorders>
               <w:top w:val="dotted" w:sz="12" w:space="0" w:color="000000" w:themeColor="text1"/>
               <w:left w:val="nil"/>
@@ -1139,7 +1240,7 @@
         <w:tc>
           <w:tcPr>
             <w:tcW w:w="6543" w:type="dxa"/>
-            <w:gridSpan w:val="3"/>
+            <w:gridSpan w:val="2"/>
             <w:tcBorders>
               <w:top w:val="nil"/>
               <w:left w:val="nil"/>
@@ -1155,6 +1256,7 @@
                 <w:numId w:val="7"/>
               </w:numPr>
               <w:rPr>
+                <w:rFonts w:asciiTheme="minorHAnsi" w:hAnsiTheme="minorHAnsi"/>
                 <w:i/>
                 <w:iCs/>
                 <w:sz w:val="20"/>
@@ -1165,10 +1267,11 @@
             <w:r>
               <w:rPr>
                 <w:rStyle w:val="Bold"/>
-                <w:rFonts w:ascii="Times New Roman" w:hAnsi="Times New Roman"/>
                 <w:b w:val="0"/>
                 <w:i/>
                 <w:iCs/>
+                <w:sz w:val="20"/>
+                <w:szCs w:val="20"/>
               </w:rPr>
               <w:t xml:space="preserve">The Construction and Implementation of the </w:t>
             </w:r>
@@ -1176,10 +1279,11 @@
             <w:r>
               <w:rPr>
                 <w:rStyle w:val="Bold"/>
-                <w:rFonts w:ascii="Times New Roman" w:hAnsi="Times New Roman"/>
                 <w:b w:val="0"/>
                 <w:i/>
                 <w:iCs/>
+                <w:sz w:val="20"/>
+                <w:szCs w:val="20"/>
               </w:rPr>
               <w:t>Jyutping</w:t>
             </w:r>
@@ -1187,10 +1291,11 @@
             <w:r>
               <w:rPr>
                 <w:rStyle w:val="Bold"/>
-                <w:rFonts w:ascii="Times New Roman" w:hAnsi="Times New Roman"/>
                 <w:b w:val="0"/>
                 <w:i/>
                 <w:iCs/>
+                <w:sz w:val="20"/>
+                <w:szCs w:val="20"/>
               </w:rPr>
               <w:t xml:space="preserve">++ </w:t>
             </w:r>
@@ -1199,7 +1304,7 @@
         <w:tc>
           <w:tcPr>
             <w:tcW w:w="3480" w:type="dxa"/>
-            <w:gridSpan w:val="3"/>
+            <w:gridSpan w:val="5"/>
             <w:tcBorders>
               <w:top w:val="nil"/>
               <w:left w:val="nil"/>
@@ -1213,6 +1318,8 @@
               <w:rPr>
                 <w:i/>
                 <w:iCs/>
+                <w:sz w:val="20"/>
+                <w:szCs w:val="20"/>
               </w:rPr>
             </w:pPr>
             <w:r>
@@ -1257,7 +1364,7 @@
         <w:tc>
           <w:tcPr>
             <w:tcW w:w="10023" w:type="dxa"/>
-            <w:gridSpan w:val="6"/>
+            <w:gridSpan w:val="7"/>
             <w:tcBorders>
               <w:top w:val="nil"/>
               <w:left w:val="nil"/>
@@ -1273,6 +1380,7 @@
                 <w:numId w:val="7"/>
               </w:numPr>
               <w:rPr>
+                <w:rFonts w:asciiTheme="minorHAnsi" w:hAnsiTheme="minorHAnsi"/>
                 <w:i/>
                 <w:iCs/>
                 <w:sz w:val="20"/>
@@ -1282,44 +1390,90 @@
             </w:pPr>
             <w:proofErr w:type="spellStart"/>
             <w:r>
+              <w:rPr>
+                <w:rFonts w:asciiTheme="minorHAnsi" w:hAnsiTheme="minorHAnsi"/>
+                <w:sz w:val="20"/>
+                <w:szCs w:val="20"/>
+              </w:rPr>
               <w:t>Jyutping</w:t>
             </w:r>
             <w:proofErr w:type="spellEnd"/>
             <w:r>
+              <w:rPr>
+                <w:rFonts w:asciiTheme="minorHAnsi" w:hAnsiTheme="minorHAnsi"/>
+                <w:sz w:val="20"/>
+                <w:szCs w:val="20"/>
+              </w:rPr>
               <w:t xml:space="preserve">++ is an extended </w:t>
             </w:r>
             <w:proofErr w:type="spellStart"/>
             <w:r>
+              <w:rPr>
+                <w:rFonts w:asciiTheme="minorHAnsi" w:hAnsiTheme="minorHAnsi"/>
+                <w:sz w:val="20"/>
+                <w:szCs w:val="20"/>
+              </w:rPr>
               <w:t>Jyutping</w:t>
             </w:r>
             <w:proofErr w:type="spellEnd"/>
             <w:r>
+              <w:rPr>
+                <w:rFonts w:asciiTheme="minorHAnsi" w:hAnsiTheme="minorHAnsi"/>
+                <w:sz w:val="20"/>
+                <w:szCs w:val="20"/>
+              </w:rPr>
               <w:t xml:space="preserve"> romanization schemes for Yue varieties. It extends the function of </w:t>
             </w:r>
             <w:proofErr w:type="spellStart"/>
             <w:r>
+              <w:rPr>
+                <w:rFonts w:asciiTheme="minorHAnsi" w:hAnsiTheme="minorHAnsi"/>
+                <w:sz w:val="20"/>
+                <w:szCs w:val="20"/>
+              </w:rPr>
               <w:t>Jyutping</w:t>
             </w:r>
             <w:proofErr w:type="spellEnd"/>
             <w:r>
+              <w:rPr>
+                <w:rFonts w:asciiTheme="minorHAnsi" w:hAnsiTheme="minorHAnsi"/>
+                <w:sz w:val="20"/>
+                <w:szCs w:val="20"/>
+              </w:rPr>
               <w:t xml:space="preserve"> to describe the Yue Language phonetic systems. This schema was applied to various Cantonese IME schema and dictionary of </w:t>
             </w:r>
             <w:proofErr w:type="spellStart"/>
             <w:r>
+              <w:rPr>
+                <w:rFonts w:asciiTheme="minorHAnsi" w:hAnsiTheme="minorHAnsi"/>
+                <w:sz w:val="20"/>
+                <w:szCs w:val="20"/>
+              </w:rPr>
               <w:t>Bakhoi</w:t>
             </w:r>
             <w:proofErr w:type="spellEnd"/>
             <w:r>
+              <w:rPr>
+                <w:rFonts w:asciiTheme="minorHAnsi" w:hAnsiTheme="minorHAnsi"/>
+                <w:sz w:val="20"/>
+                <w:szCs w:val="20"/>
+              </w:rPr>
               <w:t>(</w:t>
             </w:r>
             <w:r>
               <w:rPr>
+                <w:rFonts w:asciiTheme="minorHAnsi" w:hAnsiTheme="minorHAnsi"/>
+                <w:sz w:val="20"/>
+                <w:szCs w:val="20"/>
                 <w:lang w:eastAsia="zh-TW"/>
               </w:rPr>
               <w:t>北海白話字典</w:t>
             </w:r>
             <w:r>
               <w:rPr>
+                <w:rFonts w:asciiTheme="minorHAnsi" w:hAnsiTheme="minorHAnsi"/>
+                <w:sz w:val="20"/>
+                <w:szCs w:val="20"/>
                 <w:lang w:eastAsia="zh-TW"/>
               </w:rPr>
               <w:t xml:space="preserve">) and </w:t>
@@ -1327,6 +1481,9 @@
             <w:proofErr w:type="spellStart"/>
             <w:r>
               <w:rPr>
+                <w:rFonts w:asciiTheme="minorHAnsi" w:hAnsiTheme="minorHAnsi"/>
+                <w:sz w:val="20"/>
+                <w:szCs w:val="20"/>
                 <w:lang w:eastAsia="zh-TW"/>
               </w:rPr>
               <w:t>Hamzau</w:t>
@@ -1334,18 +1491,27 @@
             <w:proofErr w:type="spellEnd"/>
             <w:r>
               <w:rPr>
+                <w:rFonts w:asciiTheme="minorHAnsi" w:hAnsiTheme="minorHAnsi"/>
+                <w:sz w:val="20"/>
+                <w:szCs w:val="20"/>
                 <w:lang w:eastAsia="zh-TW"/>
               </w:rPr>
               <w:t>(</w:t>
             </w:r>
             <w:r>
               <w:rPr>
+                <w:rFonts w:asciiTheme="minorHAnsi" w:hAnsiTheme="minorHAnsi"/>
+                <w:sz w:val="20"/>
+                <w:szCs w:val="20"/>
                 <w:lang w:eastAsia="zh-TW"/>
               </w:rPr>
               <w:t>欽州白話字典</w:t>
             </w:r>
             <w:r>
               <w:rPr>
+                <w:rFonts w:asciiTheme="minorHAnsi" w:hAnsiTheme="minorHAnsi"/>
+                <w:sz w:val="20"/>
+                <w:szCs w:val="20"/>
                 <w:lang w:eastAsia="zh-TW"/>
               </w:rPr>
               <w:t>) and online Yue varieties dictionary (</w:t>
@@ -1354,6 +1520,9 @@
               <w:r>
                 <w:rPr>
                   <w:rStyle w:val="Hyperlink"/>
+                  <w:rFonts w:asciiTheme="minorHAnsi" w:hAnsiTheme="minorHAnsi"/>
+                  <w:sz w:val="20"/>
+                  <w:szCs w:val="20"/>
                   <w:lang w:eastAsia="zh-TW"/>
                 </w:rPr>
                 <w:t>https://jyutdict.org</w:t>
@@ -1361,18 +1530,27 @@
             </w:hyperlink>
             <w:r>
               <w:rPr>
+                <w:rFonts w:asciiTheme="minorHAnsi" w:hAnsiTheme="minorHAnsi"/>
+                <w:sz w:val="20"/>
+                <w:szCs w:val="20"/>
                 <w:lang w:eastAsia="zh-TW"/>
               </w:rPr>
               <w:t>) (</w:t>
             </w:r>
             <w:r>
               <w:rPr>
+                <w:rFonts w:asciiTheme="minorHAnsi" w:hAnsiTheme="minorHAnsi"/>
+                <w:sz w:val="20"/>
+                <w:szCs w:val="20"/>
                 <w:lang w:eastAsia="zh-TW"/>
               </w:rPr>
               <w:t>泛粵大典</w:t>
             </w:r>
             <w:r>
               <w:rPr>
+                <w:rFonts w:asciiTheme="minorHAnsi" w:hAnsiTheme="minorHAnsi"/>
+                <w:sz w:val="20"/>
+                <w:szCs w:val="20"/>
                 <w:lang w:eastAsia="zh-TW"/>
               </w:rPr>
               <w:t>Pan-Cantonese Dictionary).</w:t>
@@ -1387,7 +1565,7 @@
         <w:tc>
           <w:tcPr>
             <w:tcW w:w="6543" w:type="dxa"/>
-            <w:gridSpan w:val="3"/>
+            <w:gridSpan w:val="2"/>
             <w:tcBorders>
               <w:top w:val="nil"/>
               <w:left w:val="nil"/>
@@ -1411,7 +1589,7 @@
         <w:tc>
           <w:tcPr>
             <w:tcW w:w="3480" w:type="dxa"/>
-            <w:gridSpan w:val="3"/>
+            <w:gridSpan w:val="5"/>
             <w:tcBorders>
               <w:top w:val="nil"/>
               <w:left w:val="nil"/>
@@ -1437,7 +1615,7 @@
         <w:tc>
           <w:tcPr>
             <w:tcW w:w="6543" w:type="dxa"/>
-            <w:gridSpan w:val="3"/>
+            <w:gridSpan w:val="2"/>
             <w:tcBorders>
               <w:top w:val="nil"/>
               <w:left w:val="nil"/>
@@ -1489,7 +1667,7 @@
         <w:tc>
           <w:tcPr>
             <w:tcW w:w="3480" w:type="dxa"/>
-            <w:gridSpan w:val="3"/>
+            <w:gridSpan w:val="5"/>
             <w:tcBorders>
               <w:top w:val="nil"/>
               <w:left w:val="nil"/>
@@ -1524,7 +1702,7 @@
         <w:tc>
           <w:tcPr>
             <w:tcW w:w="10023" w:type="dxa"/>
-            <w:gridSpan w:val="6"/>
+            <w:gridSpan w:val="7"/>
             <w:tcBorders>
               <w:top w:val="single" w:sz="12" w:space="0" w:color="auto"/>
               <w:left w:val="nil"/>
@@ -1665,7 +1843,7 @@
         <w:tc>
           <w:tcPr>
             <w:tcW w:w="7691" w:type="dxa"/>
-            <w:gridSpan w:val="5"/>
+            <w:gridSpan w:val="4"/>
             <w:tcBorders>
               <w:top w:val="none" w:sz="12" w:space="0" w:color="000000" w:themeColor="text1"/>
               <w:left w:val="none" w:sz="4" w:space="0" w:color="000000" w:themeColor="text1"/>
@@ -1688,6 +1866,7 @@
                 <w:sz w:val="20"/>
                 <w:szCs w:val="20"/>
               </w:rPr>
+              <w:lastRenderedPageBreak/>
               <w:t>Chinese newspaper corpus system</w:t>
             </w:r>
           </w:p>
@@ -1695,6 +1874,7 @@
         <w:tc>
           <w:tcPr>
             <w:tcW w:w="2332" w:type="dxa"/>
+            <w:gridSpan w:val="3"/>
             <w:tcBorders>
               <w:top w:val="none" w:sz="12" w:space="0" w:color="000000" w:themeColor="text1"/>
               <w:left w:val="none" w:sz="12" w:space="0" w:color="000000" w:themeColor="text1"/>
@@ -1742,7 +1922,7 @@
         <w:tc>
           <w:tcPr>
             <w:tcW w:w="10023" w:type="dxa"/>
-            <w:gridSpan w:val="6"/>
+            <w:gridSpan w:val="7"/>
             <w:tcBorders>
               <w:top w:val="single" w:sz="0" w:space="0" w:color="000000" w:themeColor="text1"/>
               <w:left w:val="none" w:sz="4" w:space="0" w:color="000000" w:themeColor="text1"/>
@@ -1794,7 +1974,7 @@
         <w:tc>
           <w:tcPr>
             <w:tcW w:w="7691" w:type="dxa"/>
-            <w:gridSpan w:val="5"/>
+            <w:gridSpan w:val="4"/>
             <w:tcBorders>
               <w:top w:val="none" w:sz="4" w:space="0" w:color="000000" w:themeColor="text1"/>
               <w:left w:val="nil"/>
@@ -1822,7 +2002,6 @@
                 <w:color w:val="000000" w:themeColor="text1"/>
                 <w:shd w:val="clear" w:color="auto" w:fill="FFFFFF"/>
               </w:rPr>
-              <w:lastRenderedPageBreak/>
               <w:t>COMMUNITY WORK</w:t>
             </w:r>
           </w:p>
@@ -1830,6 +2009,7 @@
         <w:tc>
           <w:tcPr>
             <w:tcW w:w="2332" w:type="dxa"/>
+            <w:gridSpan w:val="3"/>
             <w:tcBorders>
               <w:top w:val="none" w:sz="4" w:space="0" w:color="000000" w:themeColor="text1"/>
               <w:left w:val="nil"/>
@@ -1857,7 +2037,7 @@
         <w:tc>
           <w:tcPr>
             <w:tcW w:w="7691" w:type="dxa"/>
-            <w:gridSpan w:val="5"/>
+            <w:gridSpan w:val="4"/>
             <w:tcBorders>
               <w:top w:val="none" w:sz="4" w:space="0" w:color="000000" w:themeColor="text1"/>
               <w:left w:val="nil"/>
@@ -1918,6 +2098,7 @@
         <w:tc>
           <w:tcPr>
             <w:tcW w:w="2332" w:type="dxa"/>
+            <w:gridSpan w:val="3"/>
             <w:tcBorders>
               <w:top w:val="none" w:sz="4" w:space="0" w:color="000000" w:themeColor="text1"/>
               <w:left w:val="nil"/>
@@ -1970,7 +2151,7 @@
         <w:tc>
           <w:tcPr>
             <w:tcW w:w="10023" w:type="dxa"/>
-            <w:gridSpan w:val="6"/>
+            <w:gridSpan w:val="7"/>
             <w:tcBorders>
               <w:top w:val="single" w:sz="12" w:space="0" w:color="auto"/>
               <w:left w:val="nil"/>
@@ -2152,7 +2333,7 @@
         <w:tc>
           <w:tcPr>
             <w:tcW w:w="6265" w:type="dxa"/>
-            <w:gridSpan w:val="5"/>
+            <w:gridSpan w:val="6"/>
             <w:tcBorders>
               <w:top w:val="none" w:sz="4" w:space="0" w:color="000000" w:themeColor="text1"/>
               <w:left w:val="none" w:sz="12" w:space="0" w:color="000000" w:themeColor="text1"/>
@@ -2187,7 +2368,7 @@
         <w:tc>
           <w:tcPr>
             <w:tcW w:w="10023" w:type="dxa"/>
-            <w:gridSpan w:val="6"/>
+            <w:gridSpan w:val="7"/>
             <w:tcBorders>
               <w:top w:val="single" w:sz="12" w:space="0" w:color="000000" w:themeColor="text1"/>
               <w:left w:val="none" w:sz="4" w:space="0" w:color="000000" w:themeColor="text1"/>
@@ -2479,7 +2660,7 @@
         <w:tc>
           <w:tcPr>
             <w:tcW w:w="10023" w:type="dxa"/>
-            <w:gridSpan w:val="6"/>
+            <w:gridSpan w:val="7"/>
             <w:tcBorders>
               <w:top w:val="none" w:sz="12" w:space="0" w:color="000000" w:themeColor="text1"/>
               <w:left w:val="nil"/>
@@ -2509,7 +2690,7 @@
         <w:tc>
           <w:tcPr>
             <w:tcW w:w="10023" w:type="dxa"/>
-            <w:gridSpan w:val="6"/>
+            <w:gridSpan w:val="7"/>
             <w:tcBorders>
               <w:top w:val="none" w:sz="12" w:space="0" w:color="000000" w:themeColor="text1"/>
               <w:left w:val="none" w:sz="12" w:space="0" w:color="000000" w:themeColor="text1"/>
@@ -2609,6 +2790,7 @@
                 <w:sz w:val="24"/>
                 <w:szCs w:val="24"/>
               </w:rPr>
+              <w:lastRenderedPageBreak/>
               <w:t>Web and database tooling for language-resource projects, including PHP/MySQL-backed dictionary systems.</w:t>
             </w:r>
           </w:p>
@@ -2650,7 +2832,7 @@
         <w:tc>
           <w:tcPr>
             <w:tcW w:w="10023" w:type="dxa"/>
-            <w:gridSpan w:val="6"/>
+            <w:gridSpan w:val="7"/>
             <w:tcBorders>
               <w:top w:val="none" w:sz="12" w:space="0" w:color="000000" w:themeColor="text1"/>
               <w:left w:val="nil"/>
@@ -2671,6 +2853,7 @@
                 <w:rFonts w:ascii="Tahoma" w:eastAsia="Tahoma" w:hAnsi="Tahoma" w:cs="Tahoma"/>
                 <w:bCs/>
               </w:rPr>
+              <w:lastRenderedPageBreak/>
               <w:t>Skills</w:t>
             </w:r>
           </w:p>
@@ -2683,7 +2866,7 @@
         <w:tc>
           <w:tcPr>
             <w:tcW w:w="10023" w:type="dxa"/>
-            <w:gridSpan w:val="6"/>
+            <w:gridSpan w:val="7"/>
             <w:tcBorders>
               <w:top w:val="single" w:sz="12" w:space="0" w:color="auto"/>
               <w:left w:val="nil"/>
@@ -2700,7 +2883,6 @@
               </w:numPr>
             </w:pPr>
             <w:r>
-              <w:lastRenderedPageBreak/>
               <w:t xml:space="preserve">Languages: Cantonese (Native), Mandarin, </w:t>
             </w:r>
             <w:proofErr w:type="spellStart"/>
@@ -5608,10 +5790,35 @@
 </file>
 
 <file path=customXml/item1.xml><?xml version="1.0" encoding="utf-8"?>
-<b:Sources xmlns:b="http://schemas.openxmlformats.org/officeDocument/2006/bibliography" xmlns="http://schemas.openxmlformats.org/officeDocument/2006/bibliography" SelectedStyle="\APASixthEditionOfficeOnline.xsl" StyleName="APA" Version="6"/>
+<?mso-contentType ?>
+<FormTemplates xmlns="http://schemas.microsoft.com/sharepoint/v3/contenttype/forms">
+  <Display>DocumentLibraryForm</Display>
+  <Edit>DocumentLibraryForm</Edit>
+  <New>DocumentLibraryForm</New>
+</FormTemplates>
 </file>
 
 <file path=customXml/item2.xml><?xml version="1.0" encoding="utf-8"?>
+<p:properties xmlns:p="http://schemas.microsoft.com/office/2006/metadata/properties" xmlns:xsi="http://www.w3.org/2001/XMLSchema-instance" xmlns:pc="http://schemas.microsoft.com/office/infopath/2007/PartnerControls">
+  <documentManagement>
+    <_ip_UnifiedCompliancePolicyUIAction xmlns="http://schemas.microsoft.com/sharepoint/v3" xsi:nil="true"/>
+    <Image xmlns="71af3243-3dd4-4a8d-8c0d-dd76da1f02a5">
+      <Url xsi:nil="true"/>
+      <Description xsi:nil="true"/>
+    </Image>
+    <Status xmlns="71af3243-3dd4-4a8d-8c0d-dd76da1f02a5">Not started</Status>
+    <Background xmlns="71af3243-3dd4-4a8d-8c0d-dd76da1f02a5">false</Background>
+    <_ip_UnifiedCompliancePolicyProperties xmlns="http://schemas.microsoft.com/sharepoint/v3" xsi:nil="true"/>
+    <ImageTagsTaxHTField xmlns="71af3243-3dd4-4a8d-8c0d-dd76da1f02a5">
+      <Terms xmlns="http://schemas.microsoft.com/office/infopath/2007/PartnerControls"/>
+    </ImageTagsTaxHTField>
+    <TaxCatchAll xmlns="230e9df3-be65-4c73-a93b-d1236ebd677e" xsi:nil="true"/>
+    <MediaServiceKeyPoints xmlns="71af3243-3dd4-4a8d-8c0d-dd76da1f02a5" xsi:nil="true"/>
+  </documentManagement>
+</p:properties>
+</file>
+
+<file path=customXml/item3.xml><?xml version="1.0" encoding="utf-8"?>
 <ct:contentTypeSchema xmlns:ct="http://schemas.microsoft.com/office/2006/metadata/contentType" xmlns:ma="http://schemas.microsoft.com/office/2006/metadata/properties/metaAttributes" ct:_="" ma:_="" ma:contentTypeName="Document" ma:contentTypeID="0x01010079F111ED35F8CC479449609E8A0923A6" ma:contentTypeVersion="26" ma:contentTypeDescription="Create a new document." ma:contentTypeScope="" ma:versionID="ac37c1753acd5e330d2062ccec26ea66">
   <xsd:schema xmlns:xsd="http://www.w3.org/2001/XMLSchema" xmlns:xs="http://www.w3.org/2001/XMLSchema" xmlns:p="http://schemas.microsoft.com/office/2006/metadata/properties" xmlns:ns1="http://schemas.microsoft.com/sharepoint/v3" xmlns:ns2="71af3243-3dd4-4a8d-8c0d-dd76da1f02a5" xmlns:ns3="16c05727-aa75-4e4a-9b5f-8a80a1165891" xmlns:ns4="230e9df3-be65-4c73-a93b-d1236ebd677e" targetNamespace="http://schemas.microsoft.com/office/2006/metadata/properties" ma:root="true" ma:fieldsID="3b340c7101c92c5120abd06486f94548" ns1:_="" ns2:_="" ns3:_="" ns4:_="">
     <xsd:import namespace="http://schemas.microsoft.com/sharepoint/v3"/>
@@ -5911,44 +6118,31 @@
 </ct:contentTypeSchema>
 </file>
 
-<file path=customXml/item3.xml><?xml version="1.0" encoding="utf-8"?>
-<p:properties xmlns:p="http://schemas.microsoft.com/office/2006/metadata/properties" xmlns:xsi="http://www.w3.org/2001/XMLSchema-instance" xmlns:pc="http://schemas.microsoft.com/office/infopath/2007/PartnerControls">
-  <documentManagement>
-    <_ip_UnifiedCompliancePolicyUIAction xmlns="http://schemas.microsoft.com/sharepoint/v3" xsi:nil="true"/>
-    <Image xmlns="71af3243-3dd4-4a8d-8c0d-dd76da1f02a5">
-      <Url xsi:nil="true"/>
-      <Description xsi:nil="true"/>
-    </Image>
-    <Status xmlns="71af3243-3dd4-4a8d-8c0d-dd76da1f02a5">Not started</Status>
-    <Background xmlns="71af3243-3dd4-4a8d-8c0d-dd76da1f02a5">false</Background>
-    <_ip_UnifiedCompliancePolicyProperties xmlns="http://schemas.microsoft.com/sharepoint/v3" xsi:nil="true"/>
-    <ImageTagsTaxHTField xmlns="71af3243-3dd4-4a8d-8c0d-dd76da1f02a5">
-      <Terms xmlns="http://schemas.microsoft.com/office/infopath/2007/PartnerControls"/>
-    </ImageTagsTaxHTField>
-    <TaxCatchAll xmlns="230e9df3-be65-4c73-a93b-d1236ebd677e" xsi:nil="true"/>
-    <MediaServiceKeyPoints xmlns="71af3243-3dd4-4a8d-8c0d-dd76da1f02a5" xsi:nil="true"/>
-  </documentManagement>
-</p:properties>
-</file>
-
 <file path=customXml/item4.xml><?xml version="1.0" encoding="utf-8"?>
-<?mso-contentType ?>
-<FormTemplates xmlns="http://schemas.microsoft.com/sharepoint/v3/contenttype/forms">
-  <Display>DocumentLibraryForm</Display>
-  <Edit>DocumentLibraryForm</Edit>
-  <New>DocumentLibraryForm</New>
-</FormTemplates>
+<b:Sources xmlns:b="http://schemas.openxmlformats.org/officeDocument/2006/bibliography" xmlns="http://schemas.openxmlformats.org/officeDocument/2006/bibliography" SelectedStyle="\APASixthEditionOfficeOnline.xsl" StyleName="APA" Version="6"/>
 </file>
 
 <file path=customXml/itemProps1.xml><?xml version="1.0" encoding="utf-8"?>
-<ds:datastoreItem xmlns:ds="http://schemas.openxmlformats.org/officeDocument/2006/customXml" ds:itemID="{8F9E5E02-5818-4E45-A5BC-64F98CD5E1AF}">
+<ds:datastoreItem xmlns:ds="http://schemas.openxmlformats.org/officeDocument/2006/customXml" ds:itemID="{51DC95FE-2BE6-460C-9B2E-B7960BEA6BD9}">
   <ds:schemaRefs>
-    <ds:schemaRef ds:uri="http://schemas.openxmlformats.org/officeDocument/2006/bibliography"/>
+    <ds:schemaRef ds:uri="http://schemas.microsoft.com/sharepoint/v3/contenttype/forms"/>
   </ds:schemaRefs>
 </ds:datastoreItem>
 </file>
 
 <file path=customXml/itemProps2.xml><?xml version="1.0" encoding="utf-8"?>
+<ds:datastoreItem xmlns:ds="http://schemas.openxmlformats.org/officeDocument/2006/customXml" ds:itemID="{9725D2C8-6850-4290-ADCF-6EF21E5F611C}">
+  <ds:schemaRefs>
+    <ds:schemaRef ds:uri="http://schemas.microsoft.com/office/2006/metadata/properties"/>
+    <ds:schemaRef ds:uri="http://schemas.microsoft.com/office/infopath/2007/PartnerControls"/>
+    <ds:schemaRef ds:uri="http://schemas.microsoft.com/sharepoint/v3"/>
+    <ds:schemaRef ds:uri="71af3243-3dd4-4a8d-8c0d-dd76da1f02a5"/>
+    <ds:schemaRef ds:uri="230e9df3-be65-4c73-a93b-d1236ebd677e"/>
+  </ds:schemaRefs>
+</ds:datastoreItem>
+</file>
+
+<file path=customXml/itemProps3.xml><?xml version="1.0" encoding="utf-8"?>
 <ds:datastoreItem xmlns:ds="http://schemas.openxmlformats.org/officeDocument/2006/customXml" ds:itemID="{026E2189-D211-4EF3-B5FA-5B78FBAFE6F6}">
   <ds:schemaRefs>
     <ds:schemaRef ds:uri="http://schemas.microsoft.com/office/2006/metadata/contentType"/>
@@ -5969,22 +6163,10 @@
 </ds:datastoreItem>
 </file>
 
-<file path=customXml/itemProps3.xml><?xml version="1.0" encoding="utf-8"?>
-<ds:datastoreItem xmlns:ds="http://schemas.openxmlformats.org/officeDocument/2006/customXml" ds:itemID="{9725D2C8-6850-4290-ADCF-6EF21E5F611C}">
+<file path=customXml/itemProps4.xml><?xml version="1.0" encoding="utf-8"?>
+<ds:datastoreItem xmlns:ds="http://schemas.openxmlformats.org/officeDocument/2006/customXml" ds:itemID="{8F9E5E02-5818-4E45-A5BC-64F98CD5E1AF}">
   <ds:schemaRefs>
-    <ds:schemaRef ds:uri="http://schemas.microsoft.com/office/2006/metadata/properties"/>
-    <ds:schemaRef ds:uri="http://schemas.microsoft.com/office/infopath/2007/PartnerControls"/>
-    <ds:schemaRef ds:uri="http://schemas.microsoft.com/sharepoint/v3"/>
-    <ds:schemaRef ds:uri="71af3243-3dd4-4a8d-8c0d-dd76da1f02a5"/>
-    <ds:schemaRef ds:uri="230e9df3-be65-4c73-a93b-d1236ebd677e"/>
-  </ds:schemaRefs>
-</ds:datastoreItem>
-</file>
-
-<file path=customXml/itemProps4.xml><?xml version="1.0" encoding="utf-8"?>
-<ds:datastoreItem xmlns:ds="http://schemas.openxmlformats.org/officeDocument/2006/customXml" ds:itemID="{51DC95FE-2BE6-460C-9B2E-B7960BEA6BD9}">
-  <ds:schemaRefs>
-    <ds:schemaRef ds:uri="http://schemas.microsoft.com/sharepoint/v3/contenttype/forms"/>
+    <ds:schemaRef ds:uri="http://schemas.openxmlformats.org/officeDocument/2006/bibliography"/>
   </ds:schemaRefs>
 </ds:datastoreItem>
 </file>

</xml_diff>